<commit_message>
DOCS(informe ejectivo) fix gramatical and format text errors
</commit_message>
<xml_diff>
--- a/Informe ejecutivo - EDA COVID-19.docx
+++ b/Informe ejecutivo - EDA COVID-19.docx
@@ -1,9 +1,13 @@
 
 <file path=word/document.xml><?xml version="1.0" encoding="utf-8"?>
-<w:document xmlns:wpc="http://schemas.microsoft.com/office/word/2010/wordprocessingCanvas" xmlns:cx="http://schemas.microsoft.com/office/drawing/2014/chartex" xmlns:cx1="http://schemas.microsoft.com/office/drawing/2015/9/8/chartex" xmlns:cx2="http://schemas.microsoft.com/office/drawing/2015/10/21/chartex" xmlns:cx3="http://schemas.microsoft.com/office/drawing/2016/5/9/chartex" xmlns:cx4="http://schemas.microsoft.com/office/drawing/2016/5/10/chartex" xmlns:cx5="http://schemas.microsoft.com/office/drawing/2016/5/11/chartex" xmlns:cx6="http://schemas.microsoft.com/office/drawing/2016/5/12/chartex" xmlns:cx7="http://schemas.microsoft.com/office/drawing/2016/5/13/chartex" xmlns:cx8="http://schemas.microsoft.com/office/drawing/2016/5/14/chartex" xmlns:mc="http://schemas.openxmlformats.org/markup-compatibility/2006" xmlns:aink="http://schemas.microsoft.com/office/drawing/2016/ink" xmlns:am3d="http://schemas.microsoft.com/office/drawing/2017/model3d" xmlns:o="urn:schemas-microsoft-com:office:office" xmlns:oel="http://schemas.microsoft.com/office/2019/extlst" xmlns:r="http://schemas.openxmlformats.org/officeDocument/2006/relationships" xmlns:m="http://schemas.openxmlformats.org/officeDocument/2006/math" xmlns:v="urn:schemas-microsoft-com:vml" xmlns:wp14="http://schemas.microsoft.com/office/word/2010/wordprocessingDrawing" xmlns:wp="http://schemas.openxmlformats.org/drawingml/2006/wordprocessingDrawing" xmlns:w10="urn:schemas-microsoft-com:office:word" xmlns:w="http://schemas.openxmlformats.org/wordprocessingml/2006/main" xmlns:w14="http://schemas.microsoft.com/office/word/2010/wordml" xmlns:w15="http://schemas.microsoft.com/office/word/2012/wordml" xmlns:w16cex="http://schemas.microsoft.com/office/word/2018/wordml/cex" xmlns:w16cid="http://schemas.microsoft.com/office/word/2016/wordml/cid" xmlns:w16="http://schemas.microsoft.com/office/word/2018/wordml" xmlns:w16sdtdh="http://schemas.microsoft.com/office/word/2020/wordml/sdtdatahash" xmlns:w16se="http://schemas.microsoft.com/office/word/2015/wordml/symex" xmlns:wpg="http://schemas.microsoft.com/office/word/2010/wordprocessingGroup" xmlns:wpi="http://schemas.microsoft.com/office/word/2010/wordprocessingInk" xmlns:wne="http://schemas.microsoft.com/office/word/2006/wordml" xmlns:wps="http://schemas.microsoft.com/office/word/2010/wordprocessingShape" mc:Ignorable="w14 w15 w16se w16cid w16 w16cex w16sdtdh wp14">
+<w:document xmlns:wpc="http://schemas.microsoft.com/office/word/2010/wordprocessingCanvas" xmlns:cx="http://schemas.microsoft.com/office/drawing/2014/chartex" xmlns:cx1="http://schemas.microsoft.com/office/drawing/2015/9/8/chartex" xmlns:cx2="http://schemas.microsoft.com/office/drawing/2015/10/21/chartex" xmlns:cx3="http://schemas.microsoft.com/office/drawing/2016/5/9/chartex" xmlns:cx4="http://schemas.microsoft.com/office/drawing/2016/5/10/chartex" xmlns:cx5="http://schemas.microsoft.com/office/drawing/2016/5/11/chartex" xmlns:cx6="http://schemas.microsoft.com/office/drawing/2016/5/12/chartex" xmlns:cx7="http://schemas.microsoft.com/office/drawing/2016/5/13/chartex" xmlns:cx8="http://schemas.microsoft.com/office/drawing/2016/5/14/chartex" xmlns:mc="http://schemas.openxmlformats.org/markup-compatibility/2006" xmlns:aink="http://schemas.microsoft.com/office/drawing/2016/ink" xmlns:am3d="http://schemas.microsoft.com/office/drawing/2017/model3d" xmlns:o="urn:schemas-microsoft-com:office:office" xmlns:oel="http://schemas.microsoft.com/office/2019/extlst" xmlns:r="http://schemas.openxmlformats.org/officeDocument/2006/relationships" xmlns:m="http://schemas.openxmlformats.org/officeDocument/2006/math" xmlns:v="urn:schemas-microsoft-com:vml" xmlns:wp14="http://schemas.microsoft.com/office/word/2010/wordprocessingDrawing" xmlns:wp="http://schemas.openxmlformats.org/drawingml/2006/wordprocessingDrawing" xmlns:w10="urn:schemas-microsoft-com:office:word" xmlns:w="http://schemas.openxmlformats.org/wordprocessingml/2006/main" xmlns:w14="http://schemas.microsoft.com/office/word/2010/wordml" xmlns:w15="http://schemas.microsoft.com/office/word/2012/wordml" xmlns:w16cex="http://schemas.microsoft.com/office/word/2018/wordml/cex" xmlns:w16cid="http://schemas.microsoft.com/office/word/2016/wordml/cid" xmlns:w16="http://schemas.microsoft.com/office/word/2018/wordml" xmlns:w16du="http://schemas.microsoft.com/office/word/2023/wordml/word16du" xmlns:w16sdtdh="http://schemas.microsoft.com/office/word/2020/wordml/sdtdatahash" xmlns:w16sdtfl="http://schemas.microsoft.com/office/word/2024/wordml/sdtformatlock" xmlns:w16se="http://schemas.microsoft.com/office/word/2015/wordml/symex" xmlns:wpg="http://schemas.microsoft.com/office/word/2010/wordprocessingGroup" xmlns:wpi="http://schemas.microsoft.com/office/word/2010/wordprocessingInk" xmlns:wne="http://schemas.microsoft.com/office/word/2006/wordml" xmlns:wps="http://schemas.microsoft.com/office/word/2010/wordprocessingShape" mc:Ignorable="w14 w15 w16se w16cid w16 w16cex w16sdtdh w16sdtfl w16du wp14">
   <w:body>
     <w:sdt>
       <w:sdtPr>
+        <w:rPr>
+          <w:rFonts w:eastAsiaTheme="minorHAnsi"/>
+          <w:lang w:eastAsia="en-US"/>
+        </w:rPr>
         <w:id w:val="-1380470468"/>
         <w:docPartObj>
           <w:docPartGallery w:val="Cover Pages"/>
@@ -12,10 +16,8 @@
       </w:sdtPr>
       <w:sdtEndPr>
         <w:rPr>
-          <w:rFonts w:eastAsiaTheme="minorHAnsi"/>
           <w:b/>
           <w:bCs/>
-          <w:lang w:eastAsia="en-US"/>
         </w:rPr>
       </w:sdtEndPr>
       <w:sdtContent>
@@ -3701,7 +3703,7 @@
                                         <w:sz w:val="72"/>
                                         <w:szCs w:val="72"/>
                                       </w:rPr>
-                                      <w:t xml:space="preserve">INFORME EJECUTIVO </w:t>
+                                      <w:t>INFORME EJECUTIVO</w:t>
                                     </w:r>
                                   </w:sdtContent>
                                 </w:sdt>
@@ -3816,7 +3818,7 @@
                                   <w:sz w:val="72"/>
                                   <w:szCs w:val="72"/>
                                 </w:rPr>
-                                <w:t xml:space="preserve">INFORME EJECUTIVO </w:t>
+                                <w:t>INFORME EJECUTIVO</w:t>
                               </w:r>
                             </w:sdtContent>
                           </w:sdt>
@@ -3988,25 +3990,7 @@
                                         <w:sz w:val="26"/>
                                         <w:szCs w:val="26"/>
                                       </w:rPr>
-                                      <w:t xml:space="preserve">Manuel Macarro, Miguel Ángel Moreno y </w:t>
-                                    </w:r>
-                                    <w:proofErr w:type="spellStart"/>
-                                    <w:r>
-                                      <w:rPr>
-                                        <w:color w:val="4472C4" w:themeColor="accent1"/>
-                                        <w:sz w:val="26"/>
-                                        <w:szCs w:val="26"/>
-                                      </w:rPr>
-                                      <w:t>Yasira</w:t>
-                                    </w:r>
-                                    <w:proofErr w:type="spellEnd"/>
-                                    <w:r>
-                                      <w:rPr>
-                                        <w:color w:val="4472C4" w:themeColor="accent1"/>
-                                        <w:sz w:val="26"/>
-                                        <w:szCs w:val="26"/>
-                                      </w:rPr>
-                                      <w:t xml:space="preserve"> Blanco</w:t>
+                                      <w:t>Manuel Macarro, Miguel Ángel Moreno y Yasira Blanco</w:t>
                                     </w:r>
                                   </w:sdtContent>
                                 </w:sdt>
@@ -4065,25 +4049,7 @@
                                   <w:sz w:val="26"/>
                                   <w:szCs w:val="26"/>
                                 </w:rPr>
-                                <w:t xml:space="preserve">Manuel Macarro, Miguel Ángel Moreno y </w:t>
-                              </w:r>
-                              <w:proofErr w:type="spellStart"/>
-                              <w:r>
-                                <w:rPr>
-                                  <w:color w:val="4472C4" w:themeColor="accent1"/>
-                                  <w:sz w:val="26"/>
-                                  <w:szCs w:val="26"/>
-                                </w:rPr>
-                                <w:t>Yasira</w:t>
-                              </w:r>
-                              <w:proofErr w:type="spellEnd"/>
-                              <w:r>
-                                <w:rPr>
-                                  <w:color w:val="4472C4" w:themeColor="accent1"/>
-                                  <w:sz w:val="26"/>
-                                  <w:szCs w:val="26"/>
-                                </w:rPr>
-                                <w:t xml:space="preserve"> Blanco</w:t>
+                                <w:t>Manuel Macarro, Miguel Ángel Moreno y Yasira Blanco</w:t>
                               </w:r>
                             </w:sdtContent>
                           </w:sdt>
@@ -4108,6 +4074,13 @@
     </w:sdt>
     <w:sdt>
       <w:sdtPr>
+        <w:rPr>
+          <w:rFonts w:asciiTheme="minorHAnsi" w:eastAsiaTheme="minorHAnsi" w:hAnsiTheme="minorHAnsi" w:cstheme="minorBidi"/>
+          <w:color w:val="auto"/>
+          <w:sz w:val="22"/>
+          <w:szCs w:val="22"/>
+          <w:lang w:eastAsia="en-US"/>
+        </w:rPr>
         <w:id w:val="268981395"/>
         <w:docPartObj>
           <w:docPartGallery w:val="Table of Contents"/>
@@ -4116,13 +4089,8 @@
       </w:sdtPr>
       <w:sdtEndPr>
         <w:rPr>
-          <w:rFonts w:asciiTheme="minorHAnsi" w:eastAsiaTheme="minorHAnsi" w:hAnsiTheme="minorHAnsi" w:cstheme="minorBidi"/>
           <w:b/>
           <w:bCs/>
-          <w:color w:val="auto"/>
-          <w:sz w:val="22"/>
-          <w:szCs w:val="22"/>
-          <w:lang w:eastAsia="en-US"/>
         </w:rPr>
       </w:sdtEndPr>
       <w:sdtContent>
@@ -6433,6 +6401,9 @@
     </w:p>
     <w:p>
       <w:r>
+        <w:rPr>
+          <w:noProof/>
+        </w:rPr>
         <w:drawing>
           <wp:inline distT="0" distB="0" distL="0" distR="0" wp14:anchorId="09C56DB6" wp14:editId="51095CB5">
             <wp:extent cx="5399978" cy="3521412"/>
@@ -7050,21 +7021,7 @@
           <w:sz w:val="24"/>
           <w:szCs w:val="24"/>
         </w:rPr>
-        <w:t xml:space="preserve">En este caso podemos observar que al principio había una alta cantidad de pruebas y de casos detectados pero que a medida que se ha ido controlando la situación ha habido menos </w:t>
-      </w:r>
-      <w:r>
-        <w:rPr>
-          <w:sz w:val="24"/>
-          <w:szCs w:val="24"/>
-        </w:rPr>
-        <w:t>pruebas</w:t>
-      </w:r>
-      <w:r>
-        <w:rPr>
-          <w:sz w:val="24"/>
-          <w:szCs w:val="24"/>
-        </w:rPr>
-        <w:t>.</w:t>
+        <w:t>En este caso podemos observar que al principio había una alta cantidad de pruebas y de casos detectados pero que a medida que se ha ido controlando la situación ha habido menos pruebas.</w:t>
       </w:r>
     </w:p>
     <w:p>
@@ -7285,7 +7242,7 @@
           <w:noProof/>
         </w:rPr>
         <w:drawing>
-          <wp:inline distT="0" distB="0" distL="0" distR="0" wp14:anchorId="25104CFF" wp14:editId="4B86640A">
+          <wp:inline distT="0" distB="0" distL="0" distR="0" wp14:anchorId="25104CFF" wp14:editId="3ADBE97C">
             <wp:extent cx="5400040" cy="3101975"/>
             <wp:effectExtent l="0" t="0" r="0" b="3175"/>
             <wp:docPr id="38" name="Imagen 38" descr="Calendario&#10;&#10;Descripción generada automáticamente"/>
@@ -7448,6 +7405,7 @@
         </w:rPr>
         <w:t xml:space="preserve"> también la </w:t>
       </w:r>
+      <w:proofErr w:type="gramStart"/>
       <w:r>
         <w:rPr>
           <w:b/>
@@ -7457,6 +7415,7 @@
         </w:rPr>
         <w:t>letalidad</w:t>
       </w:r>
+      <w:proofErr w:type="gramEnd"/>
       <w:r>
         <w:rPr>
           <w:sz w:val="24"/>
@@ -7487,7 +7446,7 @@
           <w:noProof/>
         </w:rPr>
         <w:drawing>
-          <wp:inline distT="0" distB="0" distL="0" distR="0" wp14:anchorId="3E469AEF" wp14:editId="6A29A48F">
+          <wp:inline distT="0" distB="0" distL="0" distR="0" wp14:anchorId="3E469AEF" wp14:editId="203C0D6E">
             <wp:extent cx="5400040" cy="2473960"/>
             <wp:effectExtent l="0" t="0" r="0" b="2540"/>
             <wp:docPr id="39" name="Imagen 39" descr="Gráfico, Gráfico de líneas&#10;&#10;Descripción generada automáticamente"/>
@@ -7953,9 +7912,28 @@
       </w:r>
       <w:bookmarkEnd w:id="12"/>
     </w:p>
-    <w:p/>
     <w:p>
-      <w:r>
+      <w:pPr>
+        <w:jc w:val="both"/>
+        <w:rPr>
+          <w:sz w:val="24"/>
+          <w:szCs w:val="24"/>
+        </w:rPr>
+      </w:pPr>
+    </w:p>
+    <w:p>
+      <w:pPr>
+        <w:jc w:val="both"/>
+        <w:rPr>
+          <w:sz w:val="24"/>
+          <w:szCs w:val="24"/>
+        </w:rPr>
+      </w:pPr>
+      <w:r>
+        <w:rPr>
+          <w:sz w:val="24"/>
+          <w:szCs w:val="24"/>
+        </w:rPr>
         <w:t>Del gráfico siguiente podemos obtener las siguientes conclusiones:</w:t>
       </w:r>
     </w:p>
@@ -7964,7 +7942,7 @@
         <w:pStyle w:val="Prrafodelista"/>
         <w:numPr>
           <w:ilvl w:val="0"/>
-          <w:numId w:val="16"/>
+          <w:numId w:val="17"/>
         </w:numPr>
         <w:jc w:val="both"/>
         <w:rPr>
@@ -7977,7 +7955,7 @@
           <w:sz w:val="24"/>
           <w:szCs w:val="24"/>
         </w:rPr>
-        <w:t xml:space="preserve">La </w:t>
+        <w:t>La</w:t>
       </w:r>
       <w:r>
         <w:rPr>
@@ -7986,14 +7964,14 @@
           <w:sz w:val="24"/>
           <w:szCs w:val="24"/>
         </w:rPr>
-        <w:t>tasa de positividad</w:t>
-      </w:r>
-      <w:r>
-        <w:rPr>
-          <w:sz w:val="24"/>
-          <w:szCs w:val="24"/>
-        </w:rPr>
-        <w:t xml:space="preserve"> suele aumentar antes que las hospitalizaciones.</w:t>
+        <w:t xml:space="preserve"> tasa de positividad </w:t>
+      </w:r>
+      <w:r>
+        <w:rPr>
+          <w:sz w:val="24"/>
+          <w:szCs w:val="24"/>
+        </w:rPr>
+        <w:t>suele aumentar antes que las hospitalizaciones.</w:t>
       </w:r>
     </w:p>
     <w:p>
@@ -8001,7 +7979,7 @@
         <w:pStyle w:val="Prrafodelista"/>
         <w:numPr>
           <w:ilvl w:val="0"/>
-          <w:numId w:val="16"/>
+          <w:numId w:val="17"/>
         </w:numPr>
         <w:jc w:val="both"/>
         <w:rPr>
@@ -8038,7 +8016,7 @@
         <w:pStyle w:val="Prrafodelista"/>
         <w:numPr>
           <w:ilvl w:val="0"/>
-          <w:numId w:val="16"/>
+          <w:numId w:val="17"/>
         </w:numPr>
         <w:jc w:val="both"/>
         <w:rPr>
@@ -8070,7 +8048,7 @@
         <w:pStyle w:val="Prrafodelista"/>
         <w:numPr>
           <w:ilvl w:val="0"/>
-          <w:numId w:val="16"/>
+          <w:numId w:val="17"/>
         </w:numPr>
         <w:jc w:val="both"/>
         <w:rPr>
@@ -8201,46 +8179,88 @@
     </w:p>
     <w:p/>
     <w:p>
-      <w:r>
+      <w:pPr>
+        <w:jc w:val="both"/>
+        <w:rPr>
+          <w:sz w:val="24"/>
+          <w:szCs w:val="24"/>
+        </w:rPr>
+      </w:pPr>
+      <w:r>
+        <w:rPr>
+          <w:sz w:val="24"/>
+          <w:szCs w:val="24"/>
+        </w:rPr>
         <w:t xml:space="preserve">El </w:t>
       </w:r>
       <w:r>
         <w:rPr>
           <w:b/>
           <w:bCs/>
+          <w:sz w:val="24"/>
+          <w:szCs w:val="24"/>
         </w:rPr>
         <w:t>COVID-19</w:t>
       </w:r>
       <w:r>
+        <w:rPr>
+          <w:sz w:val="24"/>
+          <w:szCs w:val="24"/>
+        </w:rPr>
         <w:t xml:space="preserve"> no evolucionó de forma uniforme en </w:t>
       </w:r>
       <w:r>
         <w:rPr>
           <w:b/>
           <w:bCs/>
+          <w:sz w:val="24"/>
+          <w:szCs w:val="24"/>
         </w:rPr>
         <w:t>Estados Unidos</w:t>
       </w:r>
       <w:r>
+        <w:rPr>
+          <w:sz w:val="24"/>
+          <w:szCs w:val="24"/>
+        </w:rPr>
         <w:t xml:space="preserve">, </w:t>
       </w:r>
       <w:r>
+        <w:rPr>
+          <w:sz w:val="24"/>
+          <w:szCs w:val="24"/>
+        </w:rPr>
         <w:t>través del EDA fue posible detectar diferencias entre estados, patrones temporales relevantes y limitaciones propias de los datos</w:t>
       </w:r>
       <w:r>
+        <w:rPr>
+          <w:sz w:val="24"/>
+          <w:szCs w:val="24"/>
+        </w:rPr>
         <w:t>.</w:t>
       </w:r>
     </w:p>
     <w:p>
-      <w:proofErr w:type="spellStart"/>
-      <w:proofErr w:type="gramStart"/>
-      <w:r>
-        <w:t>emostrando</w:t>
-      </w:r>
-      <w:proofErr w:type="spellEnd"/>
-      <w:proofErr w:type="gramEnd"/>
-      <w:r>
-        <w:t xml:space="preserve"> cómo el análisis exploratorio puede generar conocimiento útil incluso antes de aplicar modelos predictivos.</w:t>
+      <w:pPr>
+        <w:jc w:val="both"/>
+        <w:rPr>
+          <w:sz w:val="24"/>
+          <w:szCs w:val="24"/>
+        </w:rPr>
+      </w:pPr>
+      <w:r>
+        <w:rPr>
+          <w:sz w:val="24"/>
+          <w:szCs w:val="24"/>
+        </w:rPr>
+        <w:t>D</w:t>
+      </w:r>
+      <w:r>
+        <w:rPr>
+          <w:sz w:val="24"/>
+          <w:szCs w:val="24"/>
+        </w:rPr>
+        <w:t>emostrando cómo el análisis exploratorio puede generar conocimiento útil incluso antes de aplicar modelos predictivos.</w:t>
       </w:r>
     </w:p>
     <w:p/>
@@ -8258,7 +8278,7 @@
 </file>
 
 <file path=word/endnotes.xml><?xml version="1.0" encoding="utf-8"?>
-<w:endnotes xmlns:wpc="http://schemas.microsoft.com/office/word/2010/wordprocessingCanvas" xmlns:cx="http://schemas.microsoft.com/office/drawing/2014/chartex" xmlns:cx1="http://schemas.microsoft.com/office/drawing/2015/9/8/chartex" xmlns:cx2="http://schemas.microsoft.com/office/drawing/2015/10/21/chartex" xmlns:cx3="http://schemas.microsoft.com/office/drawing/2016/5/9/chartex" xmlns:cx4="http://schemas.microsoft.com/office/drawing/2016/5/10/chartex" xmlns:cx5="http://schemas.microsoft.com/office/drawing/2016/5/11/chartex" xmlns:cx6="http://schemas.microsoft.com/office/drawing/2016/5/12/chartex" xmlns:cx7="http://schemas.microsoft.com/office/drawing/2016/5/13/chartex" xmlns:cx8="http://schemas.microsoft.com/office/drawing/2016/5/14/chartex" xmlns:mc="http://schemas.openxmlformats.org/markup-compatibility/2006" xmlns:aink="http://schemas.microsoft.com/office/drawing/2016/ink" xmlns:am3d="http://schemas.microsoft.com/office/drawing/2017/model3d" xmlns:o="urn:schemas-microsoft-com:office:office" xmlns:oel="http://schemas.microsoft.com/office/2019/extlst" xmlns:r="http://schemas.openxmlformats.org/officeDocument/2006/relationships" xmlns:m="http://schemas.openxmlformats.org/officeDocument/2006/math" xmlns:v="urn:schemas-microsoft-com:vml" xmlns:wp14="http://schemas.microsoft.com/office/word/2010/wordprocessingDrawing" xmlns:wp="http://schemas.openxmlformats.org/drawingml/2006/wordprocessingDrawing" xmlns:w10="urn:schemas-microsoft-com:office:word" xmlns:w="http://schemas.openxmlformats.org/wordprocessingml/2006/main" xmlns:w14="http://schemas.microsoft.com/office/word/2010/wordml" xmlns:w15="http://schemas.microsoft.com/office/word/2012/wordml" xmlns:w16cex="http://schemas.microsoft.com/office/word/2018/wordml/cex" xmlns:w16cid="http://schemas.microsoft.com/office/word/2016/wordml/cid" xmlns:w16="http://schemas.microsoft.com/office/word/2018/wordml" xmlns:w16sdtdh="http://schemas.microsoft.com/office/word/2020/wordml/sdtdatahash" xmlns:w16se="http://schemas.microsoft.com/office/word/2015/wordml/symex" xmlns:wpg="http://schemas.microsoft.com/office/word/2010/wordprocessingGroup" xmlns:wpi="http://schemas.microsoft.com/office/word/2010/wordprocessingInk" xmlns:wne="http://schemas.microsoft.com/office/word/2006/wordml" xmlns:wps="http://schemas.microsoft.com/office/word/2010/wordprocessingShape" mc:Ignorable="w14 w15 w16se w16cid w16 w16cex w16sdtdh wp14">
+<w:endnotes xmlns:wpc="http://schemas.microsoft.com/office/word/2010/wordprocessingCanvas" xmlns:cx="http://schemas.microsoft.com/office/drawing/2014/chartex" xmlns:cx1="http://schemas.microsoft.com/office/drawing/2015/9/8/chartex" xmlns:cx2="http://schemas.microsoft.com/office/drawing/2015/10/21/chartex" xmlns:cx3="http://schemas.microsoft.com/office/drawing/2016/5/9/chartex" xmlns:cx4="http://schemas.microsoft.com/office/drawing/2016/5/10/chartex" xmlns:cx5="http://schemas.microsoft.com/office/drawing/2016/5/11/chartex" xmlns:cx6="http://schemas.microsoft.com/office/drawing/2016/5/12/chartex" xmlns:cx7="http://schemas.microsoft.com/office/drawing/2016/5/13/chartex" xmlns:cx8="http://schemas.microsoft.com/office/drawing/2016/5/14/chartex" xmlns:mc="http://schemas.openxmlformats.org/markup-compatibility/2006" xmlns:aink="http://schemas.microsoft.com/office/drawing/2016/ink" xmlns:am3d="http://schemas.microsoft.com/office/drawing/2017/model3d" xmlns:o="urn:schemas-microsoft-com:office:office" xmlns:oel="http://schemas.microsoft.com/office/2019/extlst" xmlns:r="http://schemas.openxmlformats.org/officeDocument/2006/relationships" xmlns:m="http://schemas.openxmlformats.org/officeDocument/2006/math" xmlns:v="urn:schemas-microsoft-com:vml" xmlns:wp14="http://schemas.microsoft.com/office/word/2010/wordprocessingDrawing" xmlns:wp="http://schemas.openxmlformats.org/drawingml/2006/wordprocessingDrawing" xmlns:w10="urn:schemas-microsoft-com:office:word" xmlns:w="http://schemas.openxmlformats.org/wordprocessingml/2006/main" xmlns:w14="http://schemas.microsoft.com/office/word/2010/wordml" xmlns:w15="http://schemas.microsoft.com/office/word/2012/wordml" xmlns:w16cex="http://schemas.microsoft.com/office/word/2018/wordml/cex" xmlns:w16cid="http://schemas.microsoft.com/office/word/2016/wordml/cid" xmlns:w16="http://schemas.microsoft.com/office/word/2018/wordml" xmlns:w16du="http://schemas.microsoft.com/office/word/2023/wordml/word16du" xmlns:w16sdtdh="http://schemas.microsoft.com/office/word/2020/wordml/sdtdatahash" xmlns:w16sdtfl="http://schemas.microsoft.com/office/word/2024/wordml/sdtformatlock" xmlns:w16se="http://schemas.microsoft.com/office/word/2015/wordml/symex" xmlns:wpg="http://schemas.microsoft.com/office/word/2010/wordprocessingGroup" xmlns:wpi="http://schemas.microsoft.com/office/word/2010/wordprocessingInk" xmlns:wne="http://schemas.microsoft.com/office/word/2006/wordml" xmlns:wps="http://schemas.microsoft.com/office/word/2010/wordprocessingShape" mc:Ignorable="w14 w15 w16se w16cid w16 w16cex w16sdtdh w16sdtfl w16du wp14">
   <w:endnote w:type="separator" w:id="-1">
     <w:p>
       <w:pPr>
@@ -8283,7 +8303,7 @@
 </file>
 
 <file path=word/footer1.xml><?xml version="1.0" encoding="utf-8"?>
-<w:ftr xmlns:wpc="http://schemas.microsoft.com/office/word/2010/wordprocessingCanvas" xmlns:cx="http://schemas.microsoft.com/office/drawing/2014/chartex" xmlns:cx1="http://schemas.microsoft.com/office/drawing/2015/9/8/chartex" xmlns:cx2="http://schemas.microsoft.com/office/drawing/2015/10/21/chartex" xmlns:cx3="http://schemas.microsoft.com/office/drawing/2016/5/9/chartex" xmlns:cx4="http://schemas.microsoft.com/office/drawing/2016/5/10/chartex" xmlns:cx5="http://schemas.microsoft.com/office/drawing/2016/5/11/chartex" xmlns:cx6="http://schemas.microsoft.com/office/drawing/2016/5/12/chartex" xmlns:cx7="http://schemas.microsoft.com/office/drawing/2016/5/13/chartex" xmlns:cx8="http://schemas.microsoft.com/office/drawing/2016/5/14/chartex" xmlns:mc="http://schemas.openxmlformats.org/markup-compatibility/2006" xmlns:aink="http://schemas.microsoft.com/office/drawing/2016/ink" xmlns:am3d="http://schemas.microsoft.com/office/drawing/2017/model3d" xmlns:o="urn:schemas-microsoft-com:office:office" xmlns:oel="http://schemas.microsoft.com/office/2019/extlst" xmlns:r="http://schemas.openxmlformats.org/officeDocument/2006/relationships" xmlns:m="http://schemas.openxmlformats.org/officeDocument/2006/math" xmlns:v="urn:schemas-microsoft-com:vml" xmlns:wp14="http://schemas.microsoft.com/office/word/2010/wordprocessingDrawing" xmlns:wp="http://schemas.openxmlformats.org/drawingml/2006/wordprocessingDrawing" xmlns:w10="urn:schemas-microsoft-com:office:word" xmlns:w="http://schemas.openxmlformats.org/wordprocessingml/2006/main" xmlns:w14="http://schemas.microsoft.com/office/word/2010/wordml" xmlns:w15="http://schemas.microsoft.com/office/word/2012/wordml" xmlns:w16cex="http://schemas.microsoft.com/office/word/2018/wordml/cex" xmlns:w16cid="http://schemas.microsoft.com/office/word/2016/wordml/cid" xmlns:w16="http://schemas.microsoft.com/office/word/2018/wordml" xmlns:w16sdtdh="http://schemas.microsoft.com/office/word/2020/wordml/sdtdatahash" xmlns:w16se="http://schemas.microsoft.com/office/word/2015/wordml/symex" xmlns:wpg="http://schemas.microsoft.com/office/word/2010/wordprocessingGroup" xmlns:wpi="http://schemas.microsoft.com/office/word/2010/wordprocessingInk" xmlns:wne="http://schemas.microsoft.com/office/word/2006/wordml" xmlns:wps="http://schemas.microsoft.com/office/word/2010/wordprocessingShape" mc:Ignorable="w14 w15 w16se w16cid w16 w16cex w16sdtdh wp14">
+<w:ftr xmlns:wpc="http://schemas.microsoft.com/office/word/2010/wordprocessingCanvas" xmlns:cx="http://schemas.microsoft.com/office/drawing/2014/chartex" xmlns:cx1="http://schemas.microsoft.com/office/drawing/2015/9/8/chartex" xmlns:cx2="http://schemas.microsoft.com/office/drawing/2015/10/21/chartex" xmlns:cx3="http://schemas.microsoft.com/office/drawing/2016/5/9/chartex" xmlns:cx4="http://schemas.microsoft.com/office/drawing/2016/5/10/chartex" xmlns:cx5="http://schemas.microsoft.com/office/drawing/2016/5/11/chartex" xmlns:cx6="http://schemas.microsoft.com/office/drawing/2016/5/12/chartex" xmlns:cx7="http://schemas.microsoft.com/office/drawing/2016/5/13/chartex" xmlns:cx8="http://schemas.microsoft.com/office/drawing/2016/5/14/chartex" xmlns:mc="http://schemas.openxmlformats.org/markup-compatibility/2006" xmlns:aink="http://schemas.microsoft.com/office/drawing/2016/ink" xmlns:am3d="http://schemas.microsoft.com/office/drawing/2017/model3d" xmlns:o="urn:schemas-microsoft-com:office:office" xmlns:oel="http://schemas.microsoft.com/office/2019/extlst" xmlns:r="http://schemas.openxmlformats.org/officeDocument/2006/relationships" xmlns:m="http://schemas.openxmlformats.org/officeDocument/2006/math" xmlns:v="urn:schemas-microsoft-com:vml" xmlns:wp14="http://schemas.microsoft.com/office/word/2010/wordprocessingDrawing" xmlns:wp="http://schemas.openxmlformats.org/drawingml/2006/wordprocessingDrawing" xmlns:w10="urn:schemas-microsoft-com:office:word" xmlns:w="http://schemas.openxmlformats.org/wordprocessingml/2006/main" xmlns:w14="http://schemas.microsoft.com/office/word/2010/wordml" xmlns:w15="http://schemas.microsoft.com/office/word/2012/wordml" xmlns:w16cex="http://schemas.microsoft.com/office/word/2018/wordml/cex" xmlns:w16cid="http://schemas.microsoft.com/office/word/2016/wordml/cid" xmlns:w16="http://schemas.microsoft.com/office/word/2018/wordml" xmlns:w16du="http://schemas.microsoft.com/office/word/2023/wordml/word16du" xmlns:w16sdtdh="http://schemas.microsoft.com/office/word/2020/wordml/sdtdatahash" xmlns:w16sdtfl="http://schemas.microsoft.com/office/word/2024/wordml/sdtformatlock" xmlns:w16se="http://schemas.microsoft.com/office/word/2015/wordml/symex" xmlns:wpg="http://schemas.microsoft.com/office/word/2010/wordprocessingGroup" xmlns:wpi="http://schemas.microsoft.com/office/word/2010/wordprocessingInk" xmlns:wne="http://schemas.microsoft.com/office/word/2006/wordml" xmlns:wps="http://schemas.microsoft.com/office/word/2010/wordprocessingShape" mc:Ignorable="w14 w15 w16se w16cid w16 w16cex w16sdtdh w16sdtfl w16du wp14">
   <w:sdt>
     <w:sdtPr>
       <w:id w:val="-2026931704"/>
@@ -8325,7 +8345,7 @@
 </file>
 
 <file path=word/footnotes.xml><?xml version="1.0" encoding="utf-8"?>
-<w:footnotes xmlns:wpc="http://schemas.microsoft.com/office/word/2010/wordprocessingCanvas" xmlns:cx="http://schemas.microsoft.com/office/drawing/2014/chartex" xmlns:cx1="http://schemas.microsoft.com/office/drawing/2015/9/8/chartex" xmlns:cx2="http://schemas.microsoft.com/office/drawing/2015/10/21/chartex" xmlns:cx3="http://schemas.microsoft.com/office/drawing/2016/5/9/chartex" xmlns:cx4="http://schemas.microsoft.com/office/drawing/2016/5/10/chartex" xmlns:cx5="http://schemas.microsoft.com/office/drawing/2016/5/11/chartex" xmlns:cx6="http://schemas.microsoft.com/office/drawing/2016/5/12/chartex" xmlns:cx7="http://schemas.microsoft.com/office/drawing/2016/5/13/chartex" xmlns:cx8="http://schemas.microsoft.com/office/drawing/2016/5/14/chartex" xmlns:mc="http://schemas.openxmlformats.org/markup-compatibility/2006" xmlns:aink="http://schemas.microsoft.com/office/drawing/2016/ink" xmlns:am3d="http://schemas.microsoft.com/office/drawing/2017/model3d" xmlns:o="urn:schemas-microsoft-com:office:office" xmlns:oel="http://schemas.microsoft.com/office/2019/extlst" xmlns:r="http://schemas.openxmlformats.org/officeDocument/2006/relationships" xmlns:m="http://schemas.openxmlformats.org/officeDocument/2006/math" xmlns:v="urn:schemas-microsoft-com:vml" xmlns:wp14="http://schemas.microsoft.com/office/word/2010/wordprocessingDrawing" xmlns:wp="http://schemas.openxmlformats.org/drawingml/2006/wordprocessingDrawing" xmlns:w10="urn:schemas-microsoft-com:office:word" xmlns:w="http://schemas.openxmlformats.org/wordprocessingml/2006/main" xmlns:w14="http://schemas.microsoft.com/office/word/2010/wordml" xmlns:w15="http://schemas.microsoft.com/office/word/2012/wordml" xmlns:w16cex="http://schemas.microsoft.com/office/word/2018/wordml/cex" xmlns:w16cid="http://schemas.microsoft.com/office/word/2016/wordml/cid" xmlns:w16="http://schemas.microsoft.com/office/word/2018/wordml" xmlns:w16sdtdh="http://schemas.microsoft.com/office/word/2020/wordml/sdtdatahash" xmlns:w16se="http://schemas.microsoft.com/office/word/2015/wordml/symex" xmlns:wpg="http://schemas.microsoft.com/office/word/2010/wordprocessingGroup" xmlns:wpi="http://schemas.microsoft.com/office/word/2010/wordprocessingInk" xmlns:wne="http://schemas.microsoft.com/office/word/2006/wordml" xmlns:wps="http://schemas.microsoft.com/office/word/2010/wordprocessingShape" mc:Ignorable="w14 w15 w16se w16cid w16 w16cex w16sdtdh wp14">
+<w:footnotes xmlns:wpc="http://schemas.microsoft.com/office/word/2010/wordprocessingCanvas" xmlns:cx="http://schemas.microsoft.com/office/drawing/2014/chartex" xmlns:cx1="http://schemas.microsoft.com/office/drawing/2015/9/8/chartex" xmlns:cx2="http://schemas.microsoft.com/office/drawing/2015/10/21/chartex" xmlns:cx3="http://schemas.microsoft.com/office/drawing/2016/5/9/chartex" xmlns:cx4="http://schemas.microsoft.com/office/drawing/2016/5/10/chartex" xmlns:cx5="http://schemas.microsoft.com/office/drawing/2016/5/11/chartex" xmlns:cx6="http://schemas.microsoft.com/office/drawing/2016/5/12/chartex" xmlns:cx7="http://schemas.microsoft.com/office/drawing/2016/5/13/chartex" xmlns:cx8="http://schemas.microsoft.com/office/drawing/2016/5/14/chartex" xmlns:mc="http://schemas.openxmlformats.org/markup-compatibility/2006" xmlns:aink="http://schemas.microsoft.com/office/drawing/2016/ink" xmlns:am3d="http://schemas.microsoft.com/office/drawing/2017/model3d" xmlns:o="urn:schemas-microsoft-com:office:office" xmlns:oel="http://schemas.microsoft.com/office/2019/extlst" xmlns:r="http://schemas.openxmlformats.org/officeDocument/2006/relationships" xmlns:m="http://schemas.openxmlformats.org/officeDocument/2006/math" xmlns:v="urn:schemas-microsoft-com:vml" xmlns:wp14="http://schemas.microsoft.com/office/word/2010/wordprocessingDrawing" xmlns:wp="http://schemas.openxmlformats.org/drawingml/2006/wordprocessingDrawing" xmlns:w10="urn:schemas-microsoft-com:office:word" xmlns:w="http://schemas.openxmlformats.org/wordprocessingml/2006/main" xmlns:w14="http://schemas.microsoft.com/office/word/2010/wordml" xmlns:w15="http://schemas.microsoft.com/office/word/2012/wordml" xmlns:w16cex="http://schemas.microsoft.com/office/word/2018/wordml/cex" xmlns:w16cid="http://schemas.microsoft.com/office/word/2016/wordml/cid" xmlns:w16="http://schemas.microsoft.com/office/word/2018/wordml" xmlns:w16du="http://schemas.microsoft.com/office/word/2023/wordml/word16du" xmlns:w16sdtdh="http://schemas.microsoft.com/office/word/2020/wordml/sdtdatahash" xmlns:w16sdtfl="http://schemas.microsoft.com/office/word/2024/wordml/sdtformatlock" xmlns:w16se="http://schemas.microsoft.com/office/word/2015/wordml/symex" xmlns:wpg="http://schemas.microsoft.com/office/word/2010/wordprocessingGroup" xmlns:wpi="http://schemas.microsoft.com/office/word/2010/wordprocessingInk" xmlns:wne="http://schemas.microsoft.com/office/word/2006/wordml" xmlns:wps="http://schemas.microsoft.com/office/word/2010/wordprocessingShape" mc:Ignorable="w14 w15 w16se w16cid w16 w16cex w16sdtdh w16sdtfl w16du wp14">
   <w:footnote w:type="separator" w:id="-1">
     <w:p>
       <w:pPr>
@@ -8350,7 +8370,7 @@
 </file>
 
 <file path=word/numbering.xml><?xml version="1.0" encoding="utf-8"?>
-<w:numbering xmlns:wpc="http://schemas.microsoft.com/office/word/2010/wordprocessingCanvas" xmlns:cx="http://schemas.microsoft.com/office/drawing/2014/chartex" xmlns:cx1="http://schemas.microsoft.com/office/drawing/2015/9/8/chartex" xmlns:cx2="http://schemas.microsoft.com/office/drawing/2015/10/21/chartex" xmlns:cx3="http://schemas.microsoft.com/office/drawing/2016/5/9/chartex" xmlns:cx4="http://schemas.microsoft.com/office/drawing/2016/5/10/chartex" xmlns:cx5="http://schemas.microsoft.com/office/drawing/2016/5/11/chartex" xmlns:cx6="http://schemas.microsoft.com/office/drawing/2016/5/12/chartex" xmlns:cx7="http://schemas.microsoft.com/office/drawing/2016/5/13/chartex" xmlns:cx8="http://schemas.microsoft.com/office/drawing/2016/5/14/chartex" xmlns:mc="http://schemas.openxmlformats.org/markup-compatibility/2006" xmlns:aink="http://schemas.microsoft.com/office/drawing/2016/ink" xmlns:am3d="http://schemas.microsoft.com/office/drawing/2017/model3d" xmlns:o="urn:schemas-microsoft-com:office:office" xmlns:oel="http://schemas.microsoft.com/office/2019/extlst" xmlns:r="http://schemas.openxmlformats.org/officeDocument/2006/relationships" xmlns:m="http://schemas.openxmlformats.org/officeDocument/2006/math" xmlns:v="urn:schemas-microsoft-com:vml" xmlns:wp14="http://schemas.microsoft.com/office/word/2010/wordprocessingDrawing" xmlns:wp="http://schemas.openxmlformats.org/drawingml/2006/wordprocessingDrawing" xmlns:w10="urn:schemas-microsoft-com:office:word" xmlns:w="http://schemas.openxmlformats.org/wordprocessingml/2006/main" xmlns:w14="http://schemas.microsoft.com/office/word/2010/wordml" xmlns:w15="http://schemas.microsoft.com/office/word/2012/wordml" xmlns:w16cex="http://schemas.microsoft.com/office/word/2018/wordml/cex" xmlns:w16cid="http://schemas.microsoft.com/office/word/2016/wordml/cid" xmlns:w16="http://schemas.microsoft.com/office/word/2018/wordml" xmlns:w16sdtdh="http://schemas.microsoft.com/office/word/2020/wordml/sdtdatahash" xmlns:w16se="http://schemas.microsoft.com/office/word/2015/wordml/symex" xmlns:wpg="http://schemas.microsoft.com/office/word/2010/wordprocessingGroup" xmlns:wpi="http://schemas.microsoft.com/office/word/2010/wordprocessingInk" xmlns:wne="http://schemas.microsoft.com/office/word/2006/wordml" xmlns:wps="http://schemas.microsoft.com/office/word/2010/wordprocessingShape" mc:Ignorable="w14 w15 w16se w16cid w16 w16cex w16sdtdh wp14">
+<w:numbering xmlns:wpc="http://schemas.microsoft.com/office/word/2010/wordprocessingCanvas" xmlns:cx="http://schemas.microsoft.com/office/drawing/2014/chartex" xmlns:cx1="http://schemas.microsoft.com/office/drawing/2015/9/8/chartex" xmlns:cx2="http://schemas.microsoft.com/office/drawing/2015/10/21/chartex" xmlns:cx3="http://schemas.microsoft.com/office/drawing/2016/5/9/chartex" xmlns:cx4="http://schemas.microsoft.com/office/drawing/2016/5/10/chartex" xmlns:cx5="http://schemas.microsoft.com/office/drawing/2016/5/11/chartex" xmlns:cx6="http://schemas.microsoft.com/office/drawing/2016/5/12/chartex" xmlns:cx7="http://schemas.microsoft.com/office/drawing/2016/5/13/chartex" xmlns:cx8="http://schemas.microsoft.com/office/drawing/2016/5/14/chartex" xmlns:mc="http://schemas.openxmlformats.org/markup-compatibility/2006" xmlns:aink="http://schemas.microsoft.com/office/drawing/2016/ink" xmlns:am3d="http://schemas.microsoft.com/office/drawing/2017/model3d" xmlns:o="urn:schemas-microsoft-com:office:office" xmlns:oel="http://schemas.microsoft.com/office/2019/extlst" xmlns:r="http://schemas.openxmlformats.org/officeDocument/2006/relationships" xmlns:m="http://schemas.openxmlformats.org/officeDocument/2006/math" xmlns:v="urn:schemas-microsoft-com:vml" xmlns:wp14="http://schemas.microsoft.com/office/word/2010/wordprocessingDrawing" xmlns:wp="http://schemas.openxmlformats.org/drawingml/2006/wordprocessingDrawing" xmlns:w10="urn:schemas-microsoft-com:office:word" xmlns:w="http://schemas.openxmlformats.org/wordprocessingml/2006/main" xmlns:w14="http://schemas.microsoft.com/office/word/2010/wordml" xmlns:w15="http://schemas.microsoft.com/office/word/2012/wordml" xmlns:w16cex="http://schemas.microsoft.com/office/word/2018/wordml/cex" xmlns:w16cid="http://schemas.microsoft.com/office/word/2016/wordml/cid" xmlns:w16="http://schemas.microsoft.com/office/word/2018/wordml" xmlns:w16du="http://schemas.microsoft.com/office/word/2023/wordml/word16du" xmlns:w16sdtdh="http://schemas.microsoft.com/office/word/2020/wordml/sdtdatahash" xmlns:w16sdtfl="http://schemas.microsoft.com/office/word/2024/wordml/sdtformatlock" xmlns:w16se="http://schemas.microsoft.com/office/word/2015/wordml/symex" xmlns:wpg="http://schemas.microsoft.com/office/word/2010/wordprocessingGroup" xmlns:wpi="http://schemas.microsoft.com/office/word/2010/wordprocessingInk" xmlns:wne="http://schemas.microsoft.com/office/word/2006/wordml" xmlns:wps="http://schemas.microsoft.com/office/word/2010/wordprocessingShape" mc:Ignorable="w14 w15 w16se w16cid w16 w16cex w16sdtdh w16sdtfl w16du wp14">
   <w:abstractNum w:abstractNumId="0" w15:restartNumberingAfterBreak="0">
     <w:nsid w:val="04DE74AB"/>
     <w:multiLevelType w:val="multilevel"/>
@@ -9674,6 +9694,119 @@
     </w:lvl>
   </w:abstractNum>
   <w:abstractNum w:abstractNumId="10" w15:restartNumberingAfterBreak="0">
+    <w:nsid w:val="5DFB3C11"/>
+    <w:multiLevelType w:val="hybridMultilevel"/>
+    <w:tmpl w:val="14AA05B8"/>
+    <w:lvl w:ilvl="0" w:tplc="0C0A0001">
+      <w:start w:val="1"/>
+      <w:numFmt w:val="bullet"/>
+      <w:lvlText w:val=""/>
+      <w:lvlJc w:val="left"/>
+      <w:pPr>
+        <w:ind w:left="720" w:hanging="360"/>
+      </w:pPr>
+      <w:rPr>
+        <w:rFonts w:ascii="Symbol" w:hAnsi="Symbol" w:hint="default"/>
+      </w:rPr>
+    </w:lvl>
+    <w:lvl w:ilvl="1" w:tplc="0C0A0003" w:tentative="1">
+      <w:start w:val="1"/>
+      <w:numFmt w:val="bullet"/>
+      <w:lvlText w:val="o"/>
+      <w:lvlJc w:val="left"/>
+      <w:pPr>
+        <w:ind w:left="1440" w:hanging="360"/>
+      </w:pPr>
+      <w:rPr>
+        <w:rFonts w:ascii="Courier New" w:hAnsi="Courier New" w:cs="Courier New" w:hint="default"/>
+      </w:rPr>
+    </w:lvl>
+    <w:lvl w:ilvl="2" w:tplc="0C0A0005" w:tentative="1">
+      <w:start w:val="1"/>
+      <w:numFmt w:val="bullet"/>
+      <w:lvlText w:val=""/>
+      <w:lvlJc w:val="left"/>
+      <w:pPr>
+        <w:ind w:left="2160" w:hanging="360"/>
+      </w:pPr>
+      <w:rPr>
+        <w:rFonts w:ascii="Wingdings" w:hAnsi="Wingdings" w:hint="default"/>
+      </w:rPr>
+    </w:lvl>
+    <w:lvl w:ilvl="3" w:tplc="0C0A0001" w:tentative="1">
+      <w:start w:val="1"/>
+      <w:numFmt w:val="bullet"/>
+      <w:lvlText w:val=""/>
+      <w:lvlJc w:val="left"/>
+      <w:pPr>
+        <w:ind w:left="2880" w:hanging="360"/>
+      </w:pPr>
+      <w:rPr>
+        <w:rFonts w:ascii="Symbol" w:hAnsi="Symbol" w:hint="default"/>
+      </w:rPr>
+    </w:lvl>
+    <w:lvl w:ilvl="4" w:tplc="0C0A0003" w:tentative="1">
+      <w:start w:val="1"/>
+      <w:numFmt w:val="bullet"/>
+      <w:lvlText w:val="o"/>
+      <w:lvlJc w:val="left"/>
+      <w:pPr>
+        <w:ind w:left="3600" w:hanging="360"/>
+      </w:pPr>
+      <w:rPr>
+        <w:rFonts w:ascii="Courier New" w:hAnsi="Courier New" w:cs="Courier New" w:hint="default"/>
+      </w:rPr>
+    </w:lvl>
+    <w:lvl w:ilvl="5" w:tplc="0C0A0005" w:tentative="1">
+      <w:start w:val="1"/>
+      <w:numFmt w:val="bullet"/>
+      <w:lvlText w:val=""/>
+      <w:lvlJc w:val="left"/>
+      <w:pPr>
+        <w:ind w:left="4320" w:hanging="360"/>
+      </w:pPr>
+      <w:rPr>
+        <w:rFonts w:ascii="Wingdings" w:hAnsi="Wingdings" w:hint="default"/>
+      </w:rPr>
+    </w:lvl>
+    <w:lvl w:ilvl="6" w:tplc="0C0A0001" w:tentative="1">
+      <w:start w:val="1"/>
+      <w:numFmt w:val="bullet"/>
+      <w:lvlText w:val=""/>
+      <w:lvlJc w:val="left"/>
+      <w:pPr>
+        <w:ind w:left="5040" w:hanging="360"/>
+      </w:pPr>
+      <w:rPr>
+        <w:rFonts w:ascii="Symbol" w:hAnsi="Symbol" w:hint="default"/>
+      </w:rPr>
+    </w:lvl>
+    <w:lvl w:ilvl="7" w:tplc="0C0A0003" w:tentative="1">
+      <w:start w:val="1"/>
+      <w:numFmt w:val="bullet"/>
+      <w:lvlText w:val="o"/>
+      <w:lvlJc w:val="left"/>
+      <w:pPr>
+        <w:ind w:left="5760" w:hanging="360"/>
+      </w:pPr>
+      <w:rPr>
+        <w:rFonts w:ascii="Courier New" w:hAnsi="Courier New" w:cs="Courier New" w:hint="default"/>
+      </w:rPr>
+    </w:lvl>
+    <w:lvl w:ilvl="8" w:tplc="0C0A0005" w:tentative="1">
+      <w:start w:val="1"/>
+      <w:numFmt w:val="bullet"/>
+      <w:lvlText w:val=""/>
+      <w:lvlJc w:val="left"/>
+      <w:pPr>
+        <w:ind w:left="6480" w:hanging="360"/>
+      </w:pPr>
+      <w:rPr>
+        <w:rFonts w:ascii="Wingdings" w:hAnsi="Wingdings" w:hint="default"/>
+      </w:rPr>
+    </w:lvl>
+  </w:abstractNum>
+  <w:abstractNum w:abstractNumId="11" w15:restartNumberingAfterBreak="0">
     <w:nsid w:val="617E6F84"/>
     <w:multiLevelType w:val="hybridMultilevel"/>
     <w:tmpl w:val="C0BA2E00"/>
@@ -9786,7 +9919,7 @@
       </w:rPr>
     </w:lvl>
   </w:abstractNum>
-  <w:abstractNum w:abstractNumId="11" w15:restartNumberingAfterBreak="0">
+  <w:abstractNum w:abstractNumId="12" w15:restartNumberingAfterBreak="0">
     <w:nsid w:val="634E0602"/>
     <w:multiLevelType w:val="multilevel"/>
     <w:tmpl w:val="57F840EA"/>
@@ -9935,7 +10068,7 @@
       </w:rPr>
     </w:lvl>
   </w:abstractNum>
-  <w:abstractNum w:abstractNumId="12" w15:restartNumberingAfterBreak="0">
+  <w:abstractNum w:abstractNumId="13" w15:restartNumberingAfterBreak="0">
     <w:nsid w:val="6A8A736A"/>
     <w:multiLevelType w:val="multilevel"/>
     <w:tmpl w:val="D2327690"/>
@@ -10084,7 +10217,7 @@
       </w:rPr>
     </w:lvl>
   </w:abstractNum>
-  <w:abstractNum w:abstractNumId="13" w15:restartNumberingAfterBreak="0">
+  <w:abstractNum w:abstractNumId="14" w15:restartNumberingAfterBreak="0">
     <w:nsid w:val="703C0064"/>
     <w:multiLevelType w:val="hybridMultilevel"/>
     <w:tmpl w:val="328802C8"/>
@@ -10197,7 +10330,7 @@
       </w:rPr>
     </w:lvl>
   </w:abstractNum>
-  <w:abstractNum w:abstractNumId="14" w15:restartNumberingAfterBreak="0">
+  <w:abstractNum w:abstractNumId="15" w15:restartNumberingAfterBreak="0">
     <w:nsid w:val="7A793EFD"/>
     <w:multiLevelType w:val="hybridMultilevel"/>
     <w:tmpl w:val="65225078"/>
@@ -10310,7 +10443,7 @@
       </w:rPr>
     </w:lvl>
   </w:abstractNum>
-  <w:abstractNum w:abstractNumId="15" w15:restartNumberingAfterBreak="0">
+  <w:abstractNum w:abstractNumId="16" w15:restartNumberingAfterBreak="0">
     <w:nsid w:val="7AAD03AB"/>
     <w:multiLevelType w:val="hybridMultilevel"/>
     <w:tmpl w:val="DA14BAB4"/>
@@ -10433,10 +10566,10 @@
     <w:abstractNumId w:val="3"/>
   </w:num>
   <w:num w:numId="4" w16cid:durableId="1861124086">
-    <w:abstractNumId w:val="12"/>
+    <w:abstractNumId w:val="13"/>
   </w:num>
   <w:num w:numId="5" w16cid:durableId="1381857256">
-    <w:abstractNumId w:val="11"/>
+    <w:abstractNumId w:val="12"/>
   </w:num>
   <w:num w:numId="6" w16cid:durableId="405953970">
     <w:abstractNumId w:val="7"/>
@@ -10451,7 +10584,7 @@
     <w:abstractNumId w:val="8"/>
   </w:num>
   <w:num w:numId="10" w16cid:durableId="1018000784">
-    <w:abstractNumId w:val="10"/>
+    <w:abstractNumId w:val="11"/>
   </w:num>
   <w:num w:numId="11" w16cid:durableId="183440762">
     <w:abstractNumId w:val="2"/>
@@ -10463,19 +10596,22 @@
     <w:abstractNumId w:val="1"/>
   </w:num>
   <w:num w:numId="14" w16cid:durableId="1666545121">
+    <w:abstractNumId w:val="16"/>
+  </w:num>
+  <w:num w:numId="15" w16cid:durableId="2013141883">
     <w:abstractNumId w:val="15"/>
   </w:num>
-  <w:num w:numId="15" w16cid:durableId="2013141883">
+  <w:num w:numId="16" w16cid:durableId="1236090309">
     <w:abstractNumId w:val="14"/>
   </w:num>
-  <w:num w:numId="16" w16cid:durableId="1236090309">
-    <w:abstractNumId w:val="13"/>
+  <w:num w:numId="17" w16cid:durableId="489368851">
+    <w:abstractNumId w:val="10"/>
   </w:num>
 </w:numbering>
 </file>
 
 <file path=word/styles.xml><?xml version="1.0" encoding="utf-8"?>
-<w:styles xmlns:mc="http://schemas.openxmlformats.org/markup-compatibility/2006" xmlns:r="http://schemas.openxmlformats.org/officeDocument/2006/relationships" xmlns:w="http://schemas.openxmlformats.org/wordprocessingml/2006/main" xmlns:w14="http://schemas.microsoft.com/office/word/2010/wordml" xmlns:w15="http://schemas.microsoft.com/office/word/2012/wordml" xmlns:w16cex="http://schemas.microsoft.com/office/word/2018/wordml/cex" xmlns:w16cid="http://schemas.microsoft.com/office/word/2016/wordml/cid" xmlns:w16="http://schemas.microsoft.com/office/word/2018/wordml" xmlns:w16sdtdh="http://schemas.microsoft.com/office/word/2020/wordml/sdtdatahash" xmlns:w16se="http://schemas.microsoft.com/office/word/2015/wordml/symex" mc:Ignorable="w14 w15 w16se w16cid w16 w16cex w16sdtdh">
+<w:styles xmlns:mc="http://schemas.openxmlformats.org/markup-compatibility/2006" xmlns:r="http://schemas.openxmlformats.org/officeDocument/2006/relationships" xmlns:w="http://schemas.openxmlformats.org/wordprocessingml/2006/main" xmlns:w14="http://schemas.microsoft.com/office/word/2010/wordml" xmlns:w15="http://schemas.microsoft.com/office/word/2012/wordml" xmlns:w16cex="http://schemas.microsoft.com/office/word/2018/wordml/cex" xmlns:w16cid="http://schemas.microsoft.com/office/word/2016/wordml/cid" xmlns:w16="http://schemas.microsoft.com/office/word/2018/wordml" xmlns:w16du="http://schemas.microsoft.com/office/word/2023/wordml/word16du" xmlns:w16sdtdh="http://schemas.microsoft.com/office/word/2020/wordml/sdtdatahash" xmlns:w16sdtfl="http://schemas.microsoft.com/office/word/2024/wordml/sdtformatlock" xmlns:w16se="http://schemas.microsoft.com/office/word/2015/wordml/symex" mc:Ignorable="w14 w15 w16se w16cid w16 w16cex w16sdtdh w16sdtfl w16du">
   <w:docDefaults>
     <w:rPrDefault>
       <w:rPr>

</xml_diff>